<commit_message>
chore: remove unused file configurations and associated references
</commit_message>
<xml_diff>
--- a/output/docx/谁控制，谁负责：AI控制栈中的责任归属-含关键词.docx
+++ b/output/docx/谁控制，谁负责：AI控制栈中的责任归属-含关键词.docx
@@ -5777,7 +5777,7 @@
       <w:bookmarkStart w:id="732" w:name="x1-61001f119"/>
       <w:bookmarkStart w:id="739" w:name="x1-61004f120"/>
       <w:r>
-        <w:t xml:space="preserve">已公开的专业资料将该案标识为 Liang v. Technology Company, Hangzhou Internet Court, (2025) Zhe 0192 Min Chu No. 18143（裁判日期：2025 年 12 月 3 日）。</w:t>
+        <w:t xml:space="preserve">已公开的专业资料将该案标识为 Liang v. Technology Company, Hangzhou Internet C⁠o⁠u⁠r⁠t, (2025) Zhe 0192 Min Chu No. 18143（裁判日期：2025 年 12 月 3 日）。</w:t>
       </w:r>
       <w:r>
         <w:rPr>
@@ -5895,7 +5895,7 @@
         <w:t xml:space="preserve"> </w:t>
       </w:r>
       <w:r>
-        <w:t xml:space="preserve">570 U.S. 205 (U.S. 2013).</w:t>
+        <w:t xml:space="preserve">570 U.S. 2⁠0⁠5 (U.S. 2013).</w:t>
       </w:r>
     </w:p>
     <w:p>
@@ -6097,7 +6097,7 @@
         <w:t xml:space="preserve"> </w:t>
       </w:r>
       <w:r>
-        <w:t xml:space="preserve">(visited on 08/27/2026).</w:t>
+        <w:t xml:space="preserve">(visited on 0⁠8⁠/⁠2⁠7⁠/⁠2⁠0⁠2⁠6).</w:t>
       </w:r>
     </w:p>
     <w:p>
@@ -6131,7 +6131,7 @@
         <w:t xml:space="preserve"> </w:t>
       </w:r>
       <w:r>
-        <w:t xml:space="preserve">(visited on 08/27/2026).</w:t>
+        <w:t xml:space="preserve">(visited on 0⁠8⁠/⁠2⁠7⁠/⁠2⁠0⁠2⁠6).</w:t>
       </w:r>
     </w:p>
     <w:p>
@@ -6311,7 +6311,7 @@
         <w:t xml:space="preserve"> </w:t>
       </w:r>
       <w:r>
-        <w:t xml:space="preserve">(visited on 08/27/2026).</w:t>
+        <w:t xml:space="preserve">(visited on 0⁠8⁠/⁠2⁠7⁠/⁠2⁠0⁠2⁠6).</w:t>
       </w:r>
     </w:p>
     <w:p>
@@ -6351,7 +6351,7 @@
         <w:t xml:space="preserve"> </w:t>
       </w:r>
       <w:r>
-        <w:t xml:space="preserve">(visited on 08/27/2026).</w:t>
+        <w:t xml:space="preserve">(visited on 0⁠8⁠/⁠2⁠7⁠/⁠2⁠0⁠2⁠6).</w:t>
       </w:r>
     </w:p>
     <w:p>
@@ -6505,7 +6505,7 @@
         <w:t xml:space="preserve"> </w:t>
       </w:r>
       <w:r>
-        <w:t xml:space="preserve">(visited on 08/27/2026).</w:t>
+        <w:t xml:space="preserve">(visited on 0⁠8⁠/⁠2⁠7⁠/⁠2⁠0⁠2⁠6).</w:t>
       </w:r>
     </w:p>
     <w:p>
@@ -6641,7 +6641,7 @@
         <w:t xml:space="preserve"> </w:t>
       </w:r>
       <w:r>
-        <w:t xml:space="preserve">(visited on 08/27/2026).</w:t>
+        <w:t xml:space="preserve">(visited on 0⁠8⁠/⁠2⁠7⁠/⁠2⁠0⁠2⁠6).</w:t>
       </w:r>
     </w:p>
     <w:p>
@@ -6681,15 +6681,15 @@
         <w:t xml:space="preserve"> </w:t>
       </w:r>
       <w:r>
-        <w:t xml:space="preserve">(visited on 08/27/2026).</w:t>
-      </w:r>
-    </w:p>
-    <w:p>
-      <w:pPr>
-        <w:pStyle w:val="Definition"/>
-      </w:pPr>
-      <w:r>
-        <w:t xml:space="preserve">False Claims Act Anti-Retaliation Provision, 31 U.S.C.</w:t>
+        <w:t xml:space="preserve">(visited on 0⁠8⁠/⁠2⁠7⁠/⁠2⁠0⁠2⁠6).</w:t>
+      </w:r>
+    </w:p>
+    <w:p>
+      <w:pPr>
+        <w:pStyle w:val="Definition"/>
+      </w:pPr>
+      <w:r>
+        <w:t xml:space="preserve">False Claims Act A⁠n⁠t⁠i⁠-⁠R⁠e⁠t⁠a⁠l⁠i⁠a⁠t⁠i⁠o⁠n Provision, 31 U.S.C.</w:t>
       </w:r>
       <w:r>
         <w:t xml:space="preserve"> </w:t>
@@ -6732,7 +6732,7 @@
         <w:t xml:space="preserve"> </w:t>
       </w:r>
       <w:r>
-        <w:t xml:space="preserve">(visited on 08/27/2026).</w:t>
+        <w:t xml:space="preserve">(visited on 0⁠8⁠/⁠2⁠7⁠/⁠2⁠0⁠2⁠6).</w:t>
       </w:r>
     </w:p>
     <w:p>
@@ -6766,7 +6766,7 @@
         <w:t xml:space="preserve"> </w:t>
       </w:r>
       <w:r>
-        <w:t xml:space="preserve">(visited on 08/27/2026).</w:t>
+        <w:t xml:space="preserve">(visited on 0⁠8⁠/⁠2⁠7⁠/⁠2⁠0⁠2⁠6).</w:t>
       </w:r>
     </w:p>
     <w:p>
@@ -6851,7 +6851,7 @@
         <w:t xml:space="preserve"> </w:t>
       </w:r>
       <w:r>
-        <w:t xml:space="preserve">(visited on 08/27/2026).</w:t>
+        <w:t xml:space="preserve">(visited on 0⁠8⁠/⁠2⁠7⁠/⁠2⁠0⁠2⁠6).</w:t>
       </w:r>
     </w:p>
     <w:p>
@@ -6891,7 +6891,7 @@
         <w:t xml:space="preserve"> </w:t>
       </w:r>
       <w:r>
-        <w:t xml:space="preserve">(visited on 08/27/2026).</w:t>
+        <w:t xml:space="preserve">(visited on 0⁠8⁠/⁠2⁠7⁠/⁠2⁠0⁠2⁠6).</w:t>
       </w:r>
     </w:p>
     <w:p>
@@ -7203,7 +7203,7 @@
         <w:t xml:space="preserve"> </w:t>
       </w:r>
       <w:r>
-        <w:t xml:space="preserve">(visited on 08/27/2026).</w:t>
+        <w:t xml:space="preserve">(visited on 0⁠8⁠/⁠2⁠7⁠/⁠2⁠0⁠2⁠6).</w:t>
       </w:r>
     </w:p>
     <w:p>
@@ -7346,7 +7346,7 @@
         <w:t xml:space="preserve"> </w:t>
       </w:r>
       <w:r>
-        <w:t xml:space="preserve">(visited on 08/27/2026).</w:t>
+        <w:t xml:space="preserve">(visited on 0⁠8⁠/⁠2⁠7⁠/⁠2⁠0⁠2⁠6).</w:t>
       </w:r>
     </w:p>
     <w:p>
@@ -7486,7 +7486,7 @@
         <w:t xml:space="preserve"> </w:t>
       </w:r>
       <w:r>
-        <w:t xml:space="preserve">on 08/27/2026).</w:t>
+        <w:t xml:space="preserve">on 0⁠8⁠/⁠2⁠7⁠/⁠2⁠0⁠2⁠6).</w:t>
       </w:r>
     </w:p>
     <w:p>
@@ -7532,7 +7532,7 @@
         <w:t xml:space="preserve"> </w:t>
       </w:r>
       <w:r>
-        <w:t xml:space="preserve">08/27/2026).</w:t>
+        <w:t xml:space="preserve">0⁠8⁠/⁠2⁠7⁠/⁠2⁠0⁠2⁠6).</w:t>
       </w:r>
     </w:p>
     <w:p>
@@ -7562,7 +7562,7 @@
         <w:pStyle w:val="Definition"/>
       </w:pPr>
       <w:r>
-        <w:t xml:space="preserve">Occupational Safety and Health Act Anti-Retaliation Provision, 29 U.S.C.</w:t>
+        <w:t xml:space="preserve">Occupational Safety and Health Act A⁠n⁠t⁠i⁠-⁠R⁠e⁠t⁠a⁠l⁠i⁠a⁠t⁠i⁠o⁠n Provision, 29 U.S.C.</w:t>
       </w:r>
       <w:r>
         <w:t xml:space="preserve"> </w:t>
@@ -7617,7 +7617,7 @@
         <w:t xml:space="preserve"> </w:t>
       </w:r>
       <w:r>
-        <w:t xml:space="preserve">(visited on 08/27/2026).</w:t>
+        <w:t xml:space="preserve">(visited on 0⁠8⁠/⁠2⁠7⁠/⁠2⁠0⁠2⁠6).</w:t>
       </w:r>
     </w:p>
     <w:p>
@@ -7657,7 +7657,7 @@
         <w:t xml:space="preserve"> </w:t>
       </w:r>
       <w:r>
-        <w:t xml:space="preserve">(visited on 08/27/2026).</w:t>
+        <w:t xml:space="preserve">(visited on 0⁠8⁠/⁠2⁠7⁠/⁠2⁠0⁠2⁠6).</w:t>
       </w:r>
     </w:p>
     <w:p>
@@ -7688,7 +7688,7 @@
         <w:pStyle w:val="Definition"/>
       </w:pPr>
       <w:r>
-        <w:t xml:space="preserve">Patient Safety and Quality Improvement Act of 2005, 42 U.S.C.</w:t>
+        <w:t xml:space="preserve">Patient Safety and Quality Improvement Act o⁠f 2005, 42 U.S.C.</w:t>
       </w:r>
       <w:r>
         <w:t xml:space="preserve"> </w:t>
@@ -7764,7 +7764,7 @@
         <w:t xml:space="preserve"> </w:t>
       </w:r>
       <w:r>
-        <w:t xml:space="preserve">Systems: Process-Oriented Hazard Analysis for AI Systems. 2410.22526v2. July 1, 2026.</w:t>
+        <w:t xml:space="preserve">Systems: Process-Oriented Hazard Analysis f⁠o⁠r AI Systems. 2410.22526v2. July 1, 2026.</w:t>
       </w:r>
       <w:r>
         <w:t xml:space="preserve"> </w:t>
@@ -7790,7 +7790,7 @@
         <w:t xml:space="preserve"> </w:t>
       </w:r>
       <w:r>
-        <w:t xml:space="preserve">(visited on 08/27/2026).</w:t>
+        <w:t xml:space="preserve">(visited on 0⁠8⁠/⁠2⁠7⁠/⁠2⁠0⁠2⁠6).</w:t>
       </w:r>
     </w:p>
     <w:p>
@@ -7895,7 +7895,7 @@
         <w:t xml:space="preserve"> </w:t>
       </w:r>
       <w:r>
-        <w:t xml:space="preserve">Duties: Adjudicative Boundaries and Compliance Guidance Based on Two Cases. 2026.</w:t>
+        <w:t xml:space="preserve">Duties: Adjudicative Boundaries and Compliance G⁠u⁠i⁠d⁠a⁠n⁠c⁠e Based on Two Cases. 2026.</w:t>
       </w:r>
       <w:r>
         <w:t xml:space="preserve"> </w:t>
@@ -8064,7 +8064,7 @@
         <w:t xml:space="preserve"> </w:t>
       </w:r>
       <w:r>
-        <w:t xml:space="preserve">(visited on 08/27/2026).</w:t>
+        <w:t xml:space="preserve">(visited on 0⁠8⁠/⁠2⁠7⁠/⁠2⁠0⁠2⁠6).</w:t>
       </w:r>
     </w:p>
     <w:p>
@@ -8078,7 +8078,7 @@
         <w:t xml:space="preserve"> </w:t>
       </w:r>
       <w:r>
-        <w:t xml:space="preserve">Programs. Sept. 2024.</w:t>
+        <w:t xml:space="preserve">Programs. S⁠e⁠p⁠t⁠. 2024.</w:t>
       </w:r>
       <w:r>
         <w:t xml:space="preserve"> </w:t>
@@ -8144,7 +8144,7 @@
         <w:t xml:space="preserve"> </w:t>
       </w:r>
       <w:r>
-        <w:t xml:space="preserve">(visited on 08/27/2026).</w:t>
+        <w:t xml:space="preserve">(visited on 0⁠8⁠/⁠2⁠7⁠/⁠2⁠0⁠2⁠6).</w:t>
       </w:r>
     </w:p>
     <w:p>
@@ -8195,7 +8195,7 @@
         <w:t xml:space="preserve"> </w:t>
       </w:r>
       <w:r>
-        <w:t xml:space="preserve">(visited on 08/27/2026).</w:t>
+        <w:t xml:space="preserve">(visited on 0⁠8⁠/⁠2⁠7⁠/⁠2⁠0⁠2⁠6).</w:t>
       </w:r>
     </w:p>
     <w:p>
@@ -8273,7 +8273,7 @@
         <w:t xml:space="preserve"> </w:t>
       </w:r>
       <w:r>
-        <w:t xml:space="preserve">on 08/27/2026).</w:t>
+        <w:t xml:space="preserve">on 0⁠8⁠/⁠2⁠7⁠/⁠2⁠0⁠2⁠6).</w:t>
       </w:r>
     </w:p>
     <w:p>
@@ -8387,7 +8387,7 @@
         </w:r>
       </w:hyperlink>
       <w:r>
-        <w:t xml:space="preserve"> (visited on 08/27/2026). 该研究支持的是关于其受控暴露条件的因果命题，而非总体发生率，也不能证明 Garcia 案中的侵权因果关系。</w:t>
+        <w:t xml:space="preserve"> (visited on 0⁠8⁠/⁠2⁠7⁠/⁠2⁠0⁠2⁠6). 该研究支持的是关于其受控暴露条件的因果命题，而非总体发生率，也不能证明 Garcia 案中的侵权因果关系。</w:t>
       </w:r>
       <w:bookmarkEnd w:id="24"/>
       <w:bookmarkEnd w:id="25"/>
@@ -8423,7 +8423,7 @@
         </w:r>
       </w:hyperlink>
       <w:r>
-        <w:t xml:space="preserve"> (visited on 08/27/2026); J. Banks, Deletion, Departure, Death: Experiences of AI Companion Loss, 41 J. Soc. &amp; Pers. Relationships 3547 (2024); L. Laestadius et al., Too Human and Not Human Enough: A Grounded Theory Analysis of Mental Health Harms from Emotional Dependence on the Social Chatbot Replika, 26 New Media &amp; Soc’y 5923 (2024); R. Zhang et al., The Dark Side of AI Companionship: A Taxonomy of Harmful Algorithmic Behaviors in Human–AI Relationships CHI ’25 Proc. 1 (2025).</w:t>
+        <w:t xml:space="preserve"> (visited on 0⁠8⁠/⁠2⁠7⁠/⁠2⁠0⁠2⁠6); J. Banks, Deletion, Departure, Death: Experiences of AI Companion Loss, 41 J. Soc. &amp; Pers. Relationships 3547 (2024); L. Laestadius et al., Too Human and Not Human Enough: A Grounded Theory Analysis of Mental Health Harms from Emotional Dependence on the Social Chatbot Replika, 26 New Media &amp; Soc’y 5923 (2024); R. Zhang et al., The Dark Side of AI Companionship: A Taxonomy of Harmful Algorithmic Behaviors in Human–AI Relationships CHI ’25 Proc. 1 (2025).</w:t>
       </w:r>
       <w:bookmarkEnd w:id="30"/>
       <w:bookmarkEnd w:id="31"/>
@@ -8527,6 +8527,7 @@
     <w:p>
       <w:pPr>
         <w:pStyle w:val="FootnoteText"/>
+        <w:keepLines/>
       </w:pPr>
       <w:bookmarkStart w:id="63" w:name="x1-4007xA"/>
       <w:bookmarkStart w:id="64" w:name="x1-4008"/>
@@ -8580,7 +8581,7 @@
         </w:r>
       </w:hyperlink>
       <w:r>
-        <w:t xml:space="preserve"> (visited on 08/27/2026).</w:t>
+        <w:t xml:space="preserve"> (visited on 0⁠8⁠/⁠2⁠7⁠/⁠2⁠0⁠2⁠6).</w:t>
       </w:r>
       <w:bookmarkEnd w:id="70"/>
       <w:bookmarkEnd w:id="71"/>
@@ -8602,7 +8603,7 @@
         <w:footnoteRef/>
       </w:r>
       <w:r>
-        <w:t xml:space="preserve"> 参见 S. Rismani, R. Dobbe and A. Moon. From Silos to Systems: Process-Oriented Hazard Analysis for AI Systems. 2410.22526v2. July 1, 2026. url: </w:t>
+        <w:t xml:space="preserve"> 参见 S. Rismani, R. Dobbe and A. Moon. From Silos to Systems: Process-Oriented Hazard Analysis f⁠o⁠r AI Systems. 2410.22526v2. July 1, 2026. url: </w:t>
       </w:r>
       <w:hyperlink r:id="rId78">
         <w:r>
@@ -8613,7 +8614,7 @@
         </w:r>
       </w:hyperlink>
       <w:r>
-        <w:t xml:space="preserve"> (visited on 08/27/2026); S. Rismani et al., From Plane Crashes to Algorithmic Harm: Applicability of Safety Engineering Frameworks for Responsible ML CHI ’23 Proc. 2:1–2:18 (Apr. 19, 2023).</w:t>
+        <w:t xml:space="preserve"> (visited on 0⁠8⁠/⁠2⁠7⁠/⁠2⁠0⁠2⁠6); S. Rismani et al., From Plane Crashes to Algorithmic Harm: Applicability of Safety Engineering Frameworks for Responsible ML CHI ’23 Proc. 2:1–2:18 (Apr. 19, 2023).</w:t>
       </w:r>
       <w:bookmarkEnd w:id="76"/>
       <w:bookmarkEnd w:id="77"/>
@@ -8645,7 +8646,7 @@
         </w:r>
       </w:hyperlink>
       <w:r>
-        <w:t xml:space="preserve"> (visited on 08/27/2026).</w:t>
+        <w:t xml:space="preserve"> (visited on 0⁠8⁠/⁠2⁠7⁠/⁠2⁠0⁠2⁠6).</w:t>
       </w:r>
       <w:bookmarkEnd w:id="82"/>
       <w:bookmarkEnd w:id="83"/>
@@ -8836,7 +8837,7 @@
         </w:r>
       </w:hyperlink>
       <w:r>
-        <w:t xml:space="preserve"> (visited on 08/27/2026).</w:t>
+        <w:t xml:space="preserve"> (visited on 0⁠8⁠/⁠2⁠7⁠/⁠2⁠0⁠2⁠6).</w:t>
       </w:r>
       <w:bookmarkEnd w:id="139"/>
       <w:bookmarkEnd w:id="140"/>
@@ -8970,7 +8971,7 @@
         </w:r>
       </w:hyperlink>
       <w:r>
-        <w:t xml:space="preserve"> (visited on 08/27/2026) (para. 59(f)); European Economic and Social Committee. Opinion on Artificial Intelligence: The Consequences of Artificial Intelligence for the Digital Single Market, Production, Consumption, Employment and Society. Aug. 31, 2017. url: </w:t>
+        <w:t xml:space="preserve"> (visited on 0⁠8⁠/⁠2⁠7⁠/⁠2⁠0⁠2⁠6) (para. 59(f)); European Economic and Social Committee. Opinion on Artificial Intelligence: The Consequences of Artificial Intelligence for the Digital Single Market, Production, Consumption, Employment and Society. Aug. 31, 2017. url: </w:t>
       </w:r>
       <w:hyperlink r:id="rId171">
         <w:r>
@@ -8981,7 +8982,7 @@
         </w:r>
       </w:hyperlink>
       <w:r>
-        <w:t xml:space="preserve"> (visited on 08/27/2026) (paras. 1.12, 3.33); Artificial Intelligence and Robotics Researchers. Open Letter to the European Commission: Artificial Intelligence and Robotics. 2018. url: </w:t>
+        <w:t xml:space="preserve"> (visited on 0⁠8⁠/⁠2⁠7⁠/⁠2⁠0⁠2⁠6) (paras. 1.12, 3.33); Artificial Intelligence and Robotics Researchers. Open Letter to the European Commission: Artificial Intelligence and Robotics. 2018. url: </w:t>
       </w:r>
       <w:hyperlink r:id="rId173">
         <w:r>
@@ -8992,7 +8993,7 @@
         </w:r>
       </w:hyperlink>
       <w:r>
-        <w:t xml:space="preserve"> (visited on 08/27/2026).</w:t>
+        <w:t xml:space="preserve"> (visited on 0⁠8⁠/⁠2⁠7⁠/⁠2⁠0⁠2⁠6).</w:t>
       </w:r>
       <w:bookmarkEnd w:id="167"/>
       <w:bookmarkEnd w:id="168"/>
@@ -9059,7 +9060,7 @@
         </w:r>
       </w:hyperlink>
       <w:r>
-        <w:t xml:space="preserve"> (visited on 08/27/2026) (model act §§ 2(6), 14); Electronic Signatures in Global and National Commerce Act, 15 U.S.C. § 7001(h) (2000).</w:t>
+        <w:t xml:space="preserve"> (visited on 0⁠8⁠/⁠2⁠7⁠/⁠2⁠0⁠2⁠6) (model act §§ 2(6), 14); Electronic Signatures in Global and National Commerce Act, 15 U.S.C. § 7001(h) (2000).</w:t>
       </w:r>
       <w:bookmarkEnd w:id="183"/>
       <w:bookmarkEnd w:id="184"/>
@@ -9095,7 +9096,7 @@
         </w:r>
       </w:hyperlink>
       <w:r>
-        <w:t xml:space="preserve"> (visited on 08/27/2026).</w:t>
+        <w:t xml:space="preserve"> (visited on 0⁠8⁠/⁠2⁠7⁠/⁠2⁠0⁠2⁠6).</w:t>
       </w:r>
       <w:bookmarkEnd w:id="191"/>
       <w:bookmarkEnd w:id="192"/>
@@ -9132,7 +9133,7 @@
         </w:r>
       </w:hyperlink>
       <w:r>
-        <w:t xml:space="preserve"> (visited on 08/27/2026); M. E. Kaminski and M. L. Jones, Constructing AI Speech, 133 Yale L.J.F. 1212 (2024).</w:t>
+        <w:t xml:space="preserve"> (visited on 0⁠8⁠/⁠2⁠7⁠/⁠2⁠0⁠2⁠6); M. E. Kaminski and M. L. Jones, Constructing AI Speech, 133 Yale L.J.F. 1212 (2024).</w:t>
       </w:r>
       <w:bookmarkEnd w:id="200"/>
       <w:bookmarkEnd w:id="201"/>
@@ -9483,7 +9484,7 @@
         </w:r>
       </w:hyperlink>
       <w:r>
-        <w:t xml:space="preserve"> (visited on 08/27/2026).</w:t>
+        <w:t xml:space="preserve"> (visited on 0⁠8⁠/⁠2⁠7⁠/⁠2⁠0⁠2⁠6).</w:t>
       </w:r>
       <w:bookmarkEnd w:id="268"/>
       <w:bookmarkEnd w:id="269"/>
@@ -9515,7 +9516,7 @@
         </w:r>
       </w:hyperlink>
       <w:r>
-        <w:t xml:space="preserve"> (visited on 08/27/2026). FTC 的调查属于市场研究，并非对违法行为的认定。</w:t>
+        <w:t xml:space="preserve"> (visited on 0⁠8⁠/⁠2⁠7⁠/⁠2⁠0⁠2⁠6). FTC 的调查属于市场研究，并非对违法行为的认定。</w:t>
       </w:r>
       <w:bookmarkEnd w:id="273"/>
       <w:bookmarkEnd w:id="274"/>
@@ -9662,7 +9663,7 @@
         </w:r>
       </w:hyperlink>
       <w:r>
-        <w:t xml:space="preserve"> (visited on 08/27/2026).</w:t>
+        <w:t xml:space="preserve"> (visited on 0⁠8⁠/⁠2⁠7⁠/⁠2⁠0⁠2⁠6).</w:t>
       </w:r>
       <w:bookmarkEnd w:id="308"/>
       <w:bookmarkEnd w:id="309"/>
@@ -9993,7 +9994,7 @@
         </w:r>
       </w:hyperlink>
       <w:r>
-        <w:t xml:space="preserve"> (visited on 08/27/2026).</w:t>
+        <w:t xml:space="preserve"> (visited on 0⁠8⁠/⁠2⁠7⁠/⁠2⁠0⁠2⁠6).</w:t>
       </w:r>
       <w:bookmarkEnd w:id="369"/>
       <w:bookmarkEnd w:id="370"/>
@@ -10315,7 +10316,7 @@
         </w:r>
       </w:hyperlink>
       <w:r>
-        <w:t xml:space="preserve"> (visited on 08/27/2026); FAA SMS Rule, 14 C.F.R. pt. 5, § 5.25; National Institute of Standards and Technology, supra note </w:t>
+        <w:t xml:space="preserve"> (visited on 0⁠8⁠/⁠2⁠7⁠/⁠2⁠0⁠2⁠6); FAA SMS Rule, 14 C.F.R. pt. 5, § 5.25; National Institute of Standards and Technology, supra note </w:t>
       </w:r>
       <w:hyperlink w:anchor="x1-5010xB">
         <w:r>
@@ -10487,7 +10488,7 @@
         <w:footnoteRef/>
       </w:r>
       <w:r>
-        <w:t xml:space="preserve"> 参见 U.S. Department of Justice, Criminal Division. Evaluation of Corporate Compliance Programs. Sept. 2024. url: </w:t>
+        <w:t xml:space="preserve"> 参见 U.S. Department of Justice, Criminal Division. Evaluation of Corporate Compliance Programs. S⁠e⁠p⁠t⁠. 2024. url: </w:t>
       </w:r>
       <w:hyperlink r:id="rId476">
         <w:r>
@@ -10562,7 +10563,7 @@
         </w:r>
       </w:hyperlink>
       <w:r>
-        <w:t xml:space="preserve"> (visited on 08/27/2026).</w:t>
+        <w:t xml:space="preserve"> (visited on 0⁠8⁠/⁠2⁠7⁠/⁠2⁠0⁠2⁠6).</w:t>
       </w:r>
       <w:bookmarkEnd w:id="484"/>
       <w:bookmarkEnd w:id="485"/>
@@ -10674,6 +10675,7 @@
     <w:p>
       <w:pPr>
         <w:pStyle w:val="FootnoteText"/>
+        <w:keepLines/>
       </w:pPr>
       <w:bookmarkStart w:id="505" w:name="x1-39044xE"/>
       <w:bookmarkStart w:id="506" w:name="x1-39045"/>
@@ -11058,7 +11060,7 @@
         <w:footnoteRef/>
       </w:r>
       <w:r>
-        <w:t xml:space="preserve"> 参见 Sarbanes–Oxley Act Whistleblower Protection, 18 U.S.C. § 1514A (2024); False Claims Act Anti-Retaliation Provision, 31 U.S.C. § 3730(h) (2024); Occupational Safety and Health Act Anti-Retaliation Provision, 29 U.S.C. § 660(c) (2024).</w:t>
+        <w:t xml:space="preserve"> 参见 Sarbanes–Oxley Act Whistleblower Protection, 18 U.S.C. § 1514A (2024); False Claims Act A⁠n⁠t⁠i⁠-⁠R⁠e⁠t⁠a⁠l⁠i⁠a⁠t⁠i⁠o⁠n Provision, 31 U.S.C. § 3730(h) (2024); Occupational Safety and Health Act A⁠n⁠t⁠i⁠-⁠R⁠e⁠t⁠a⁠l⁠i⁠a⁠t⁠i⁠o⁠n Provision, 29 U.S.C. § 660(c) (2024).</w:t>
       </w:r>
       <w:bookmarkEnd w:id="575"/>
       <w:bookmarkEnd w:id="576"/>
@@ -11092,7 +11094,7 @@
         </w:r>
       </w:hyperlink>
       <w:r>
-        <w:t xml:space="preserve">; Patient Safety and Quality Improvement Act of 2005, 42 U.S.C. § 299b-21–299b-26 (2005), § 299b-22(a)–(b), (e).</w:t>
+        <w:t xml:space="preserve">; Patient Safety and Quality Improvement Act o⁠f 2005, 42 U.S.C. § 299b-21–299b-26 (2005), § 299b-22(a)–(b), (e).</w:t>
       </w:r>
       <w:bookmarkEnd w:id="581"/>
       <w:bookmarkEnd w:id="582"/>
@@ -11379,7 +11381,7 @@
         </w:r>
       </w:hyperlink>
       <w:r>
-        <w:t xml:space="preserve"> (visited on 08/27/2026).</w:t>
+        <w:t xml:space="preserve"> (visited on 0⁠8⁠/⁠2⁠7⁠/⁠2⁠0⁠2⁠6).</w:t>
       </w:r>
       <w:bookmarkEnd w:id="660"/>
       <w:bookmarkEnd w:id="661"/>
@@ -11502,7 +11504,7 @@
         </w:r>
       </w:hyperlink>
       <w:r>
-        <w:t xml:space="preserve"> (visited on 08/27/2026). 联邦管理备忘录对行政机关使用人工智能提出了类似的测试、监测、复核、采购和可移植性要求，但并未创设一般私人权利，也未为私人平台制定规则。参见 Office of Management and Budget. Accelerating Federal Use of AI Through Innovation, Governance, and Public Trust. Apr. 3, 2025. url:  </w:t>
+        <w:t xml:space="preserve"> (visited on 0⁠8⁠/⁠2⁠7⁠/⁠2⁠0⁠2⁠6). 联邦管理备忘录对行政机关使用人工智能提出了类似的测试、监测、复核、采购和可移植性要求，但并未创设一般私人权利，也未为私人平台制定规则。参见 Office of Management and Budget. Accelerating Federal Use of AI Through Innovation, Governance, and Public Trust. Apr. 3, 2025. url:  </w:t>
       </w:r>
       <w:hyperlink r:id="rId687">
         <w:r>
@@ -11513,7 +11515,7 @@
         </w:r>
       </w:hyperlink>
       <w:r>
-        <w:t xml:space="preserve"> (visited on 08/27/2026); Office of Management and Budget. Driving Efficient Acquisition of Artificial Intelligence in Government. Apr. 3, 2025. url:  </w:t>
+        <w:t xml:space="preserve"> (visited on 0⁠8⁠/⁠2⁠7⁠/⁠2⁠0⁠2⁠6); Office of Management and Budget. Driving Efficient Acquisition of Artificial Intelligence in Government. Apr. 3, 2025. url:  </w:t>
       </w:r>
       <w:hyperlink r:id="rId689">
         <w:r>
@@ -11524,7 +11526,7 @@
         </w:r>
       </w:hyperlink>
       <w:r>
-        <w:t xml:space="preserve"> (visited on 08/27/2026).</w:t>
+        <w:t xml:space="preserve"> (visited on 0⁠8⁠/⁠2⁠7⁠/⁠2⁠0⁠2⁠6).</w:t>
       </w:r>
       <w:bookmarkEnd w:id="682"/>
       <w:bookmarkEnd w:id="683"/>
@@ -11634,7 +11636,7 @@
         <w:footnoteRef/>
       </w:r>
       <w:r>
-        <w:t xml:space="preserve"> 参见 Perry v. Sindermann, 408 U.S. 593 (U.S. 1972); Agency for International Development v. Alliance for Open Society International, Inc. 570 U.S. 205 (U.S. 2013). 本文将违宪条件原则作为分析桥梁；地区法院的最终裁判则直接以报复、正当程序和《行政程序法》为依据。</w:t>
+        <w:t xml:space="preserve"> 参见 Perry v. Sindermann, 408 U.S. 593 (U.S. 1972); Agency for International Development v. Alliance for Open Society International, Inc. 570 U.S. 2⁠0⁠5 (U.S. 2013). 本文将违宪条件原则作为分析桥梁；地区法院的最终裁判则直接以报复、正当程序和《行政程序法》为依据。</w:t>
       </w:r>
       <w:bookmarkEnd w:id="714"/>
       <w:bookmarkEnd w:id="715"/>
@@ -11656,7 +11658,7 @@
         <w:footnoteRef/>
       </w:r>
       <w:r>
-        <w:t xml:space="preserve"> 参见 Shanghai Qiaowen Law Firm. AI Labeling Duties: Adjudicative Boundaries and Compliance Guidance Based on Two Cases. 2026. url: </w:t>
+        <w:t xml:space="preserve"> 参见 Shanghai Qiaowen Law Firm. AI Labeling Duties: Adjudicative Boundaries and Compliance G⁠u⁠i⁠d⁠a⁠n⁠c⁠e Based on Two Cases. 2026. url: </w:t>
       </w:r>
       <w:hyperlink r:id="rId730">
         <w:r>

</xml_diff>